<commit_message>
Intro ING: la plataforma de encuentro pasa de Google Meet a Microsoft Teams
Solo el nombre de la plataforma en el material (correo, calendario, guiones
docentes, configuracion de ExamLab): el docente ya tiene el enlace en su
propio calendario de Teams, no se automatiza nada nuevo aqui. El .gs que crea
los encuentros en Google Calendar sigue igual a proposito (crea el bloque en
el calendario personal del docente; no genera salas de Teams).
</commit_message>
<xml_diff>
--- a/Introduccion a la Ingenieria/Kit docente/Clase 1/Guion Docente Clase 1 - Presentacion del curso y diagnostico inicial.docx
+++ b/Introduccion a la Ingenieria/Kit docente/Clase 1/Guion Docente Clase 1 - Presentacion del curso y diagnostico inicial.docx
@@ -69,7 +69,7 @@
           <w:color w:val="4A4A49"/>
           <w:sz w:val="22"/>
         </w:rPr>
-        <w:t>Tipo: Clase virtual sincrónica por Google Meet · Sesión 1 de 11 · corresponde al tema 1 del microcurrículo</w:t>
+        <w:t>Tipo: Clase virtual sincrónica por Microsoft Teams · Sesión 1 de 11 · corresponde al tema 1 del microcurrículo</w:t>
       </w:r>
     </w:p>
     <w:p>
@@ -98,7 +98,7 @@
           <w:color w:val="4A4A49"/>
           <w:sz w:val="22"/>
         </w:rPr>
-        <w:t xml:space="preserve"> por Google Meet · actividades en plataformas gratuitas en la nube · los 5 equipos trabajan en </w:t>
+        <w:t xml:space="preserve"> por Microsoft Teams · actividades en plataformas gratuitas en la nube · los 5 equipos trabajan en </w:t>
       </w:r>
       <w:r>
         <w:rPr>
@@ -1106,7 +1106,7 @@
           <w:color w:val="4A4A49"/>
           <w:sz w:val="22"/>
         </w:rPr>
-        <w:t xml:space="preserve">Entre a Meet 5 min antes, comparta pantalla con la pregunta de entrada </w:t>
+        <w:t xml:space="preserve">Entre a Teams 5 min antes, comparta pantalla con la pregunta de entrada </w:t>
       </w:r>
       <w:r>
         <w:rPr>
@@ -1155,7 +1155,7 @@
           <w:color w:val="4A4A49"/>
           <w:sz w:val="22"/>
         </w:rPr>
-        <w:t xml:space="preserve"> abra el muro del curso en Padlet y pegue el enlace en el chat de Meet (y el QR en pantalla, para quien esté en el celular). Se responde sin crear cuenta. No corrija ninguna respuesta en voz alta ni señale a quien la escribió: es el primer día de universidad de varios y el muro tiene que quedar como un sitio donde se puede escribir sin costo.</w:t>
+        <w:t xml:space="preserve"> abra el muro del curso en Padlet y pegue el enlace en el chat de Teams (y el QR en pantalla, para quien esté en el celular). Se responde sin crear cuenta. No corrija ninguna respuesta en voz alta ni señale a quien la escribió: es el primer día de universidad de varios y el muro tiene que quedar como un sitio donde se puede escribir sin costo.</w:t>
       </w:r>
     </w:p>
     <w:p>
@@ -1173,7 +1173,7 @@
           <w:color w:val="4A4A49"/>
           <w:sz w:val="22"/>
         </w:rPr>
-        <w:t xml:space="preserve"> mientras entran, anote cuántos hay conectados desde la lista de participantes de Meet. Ese número decide el tamaño de los cinco equipos y lo necesita en el minuto 55. Verifique también que las </w:t>
+        <w:t xml:space="preserve"> mientras entran, anote cuántos hay conectados desde la lista de participantes de Teams. Ese número decide el tamaño de los cinco equipos y lo necesita en el minuto 55. Verifique también que las </w:t>
       </w:r>
       <w:r>
         <w:rPr>
@@ -1411,7 +1411,7 @@
           <w:color w:val="4A4A49"/>
           <w:sz w:val="22"/>
         </w:rPr>
-        <w:t xml:space="preserve"> se aplica en ExamLab: el enlace se pega en el chat de Meet y se responde en la misma sesión. La versión en documento está en </w:t>
+        <w:t xml:space="preserve"> se aplica en ExamLab: el enlace se pega en el chat de Teams y se responde en la misma sesión. La versión en documento está en </w:t>
       </w:r>
       <w:r>
         <w:rPr>

</xml_diff>